<commit_message>
Revise GitHub Organisation recommendation intro
- Reframe: no existing dev practice, guidelines for experimentation then scaling
- Replace "constat" with progressive context (what works in experimentation vs what blocks at scale)
- Add section 2.3: LLM-agnostic infrastructure (3 independent layers)
- Broaden assistant comparison beyond Claude Code (Copilot, Cursor, Continue)
- Clarify that LLM choice is reversible, GitHub is the stable foundation

https://claude.ai/code/session_01AX8JiWSuFaZ7Un1Ws6Zwr3
</commit_message>
<xml_diff>
--- a/Recommandation_GitHub_Organisation_AresCo.docx
+++ b/Recommandation_GitHub_Organisation_AresCo.docx
@@ -42,7 +42,7 @@
           <w:color w:val="051E5B"/>
           <w:sz w:val="24"/>
         </w:rPr>
-        <w:t>Centraliser le code et les outils internes Ares &amp; Co</w:t>
+        <w:t>Guidelines pour l'expérimentation et le passage à l'échelle</w:t>
       </w:r>
     </w:p>
     <w:p/>
@@ -90,7 +90,7 @@
                 <w:color w:val="2D3748"/>
                 <w:sz w:val="20"/>
               </w:rPr>
-              <w:t>Recommandation transverse</w:t>
+              <w:t>Recommandation transverse — Guidelines de développement</w:t>
             </w:r>
           </w:p>
         </w:tc>
@@ -147,7 +147,7 @@
                 <w:color w:val="051E3B"/>
                 <w:sz w:val="20"/>
               </w:rPr>
-              <w:t>Priorité</w:t>
+              <w:t>Contexte</w:t>
             </w:r>
           </w:p>
         </w:tc>
@@ -164,7 +164,44 @@
                 <w:color w:val="2D3748"/>
                 <w:sz w:val="20"/>
               </w:rPr>
-              <w:t>Haute — prérequis pour les projets collaboratifs</w:t>
+              <w:t>Structurer les pratiques de développement d'agents IA au sein du cabinet</w:t>
+            </w:r>
+          </w:p>
+        </w:tc>
+      </w:tr>
+      <w:tr>
+        <w:tc>
+          <w:tcPr>
+            <w:tcW w:type="dxa" w:w="2551"/>
+            <w:shd w:fill="F0F4F8"/>
+          </w:tcPr>
+          <w:p>
+            <w:r/>
+            <w:r>
+              <w:rPr>
+                <w:rFonts w:ascii="Arial" w:hAnsi="Arial"/>
+                <w:b/>
+                <w:color w:val="051E3B"/>
+                <w:sz w:val="20"/>
+              </w:rPr>
+              <w:t>Principe clé</w:t>
+            </w:r>
+          </w:p>
+        </w:tc>
+        <w:tc>
+          <w:tcPr>
+            <w:tcW w:type="dxa" w:w="6520"/>
+          </w:tcPr>
+          <w:p>
+            <w:r/>
+            <w:r>
+              <w:rPr>
+                <w:rFonts w:ascii="Arial" w:hAnsi="Arial"/>
+                <w:b w:val="0"/>
+                <w:color w:val="2D3748"/>
+                <w:sz w:val="20"/>
+              </w:rPr>
+              <w:t>Infrastructure agnostique du LLM — compatible Claude, GPT, Mistral, Llama, etc.</w:t>
             </w:r>
           </w:p>
         </w:tc>
@@ -223,7 +260,15 @@
         <w:spacing w:after="120"/>
       </w:pPr>
       <w:r>
-        <w:t>Cette note recommande la création d'une organisation GitHub pour Ares &amp; Co afin de centraliser le code des outils internes (newsletter, automatisations, templates). Cette infrastructure permet la collaboration entre consultants, assure la pérennité des développements, et pose les bases d'une culture de développement maîtrisée au sein du cabinet.</w:t>
+        <w:t>Ares &amp; Co initie une démarche de développement d'agents IA pour renforcer ses capacités internes (newsletter automatisée, outils d'analyse, automatisations). Il n'existe pas aujourd'hui de pratique formalisée de développement au sein du cabinet. Cette note propose les guidelines nécessaires pour structurer cette activité naissante : d'abord dans une logique d'expérimentation (quelques consultants, un premier projet pilote), puis dans une perspective de passage à l'échelle (multiplication des agents, collaboration entre équipes).</w:t>
+      </w:r>
+    </w:p>
+    <w:p>
+      <w:pPr>
+        <w:spacing w:after="120"/>
+      </w:pPr>
+      <w:r>
+        <w:t>La recommandation centrale est la mise en place d'une organisation GitHub comme socle technique commun. Cette infrastructure est volontairement agnostique du choix de LLM : elle fonctionne de la même manière que le code s'appuie sur Claude (Anthropic), GPT (OpenAI), Mistral, Llama (Meta), ou tout autre modèle. Le choix du LLM est une décision indépendante, qui peut évoluer dans le temps sans impacter l'infrastructure de versioning et de collaboration.</w:t>
       </w:r>
     </w:p>
     <w:p>
@@ -236,7 +281,7 @@
         <w:pStyle w:val="Heading1"/>
       </w:pPr>
       <w:r>
-        <w:t>1. Constat : les limites du travail en local</w:t>
+        <w:t>1. Contexte : une activité de développement naissante</w:t>
       </w:r>
     </w:p>
     <w:p>
@@ -244,7 +289,58 @@
         <w:spacing w:after="120"/>
       </w:pPr>
       <w:r>
-        <w:t>Aujourd'hui, les projets de développement (newsletter, outils d'automatisation, scripts) sont réalisés sur les postes individuels des consultants, sans infrastructure de partage. Cette approche présente plusieurs risques :</w:t>
+        <w:t>Ares &amp; Co est un cabinet de conseil de Direction Générale. Le développement logiciel ne fait pas partie de son cœur de métier. Cependant, l'émergence des LLMs (Claude, GPT, Mistral, etc.) ouvre des opportunités concrètes pour créer des outils internes augmentés par l'IA : newsletters automatisées, agents d'analyse sectorielle, automatisations de reporting.</w:t>
+      </w:r>
+    </w:p>
+    <w:p>
+      <w:pPr>
+        <w:spacing w:after="120"/>
+      </w:pPr>
+      <w:r>
+        <w:t>Aujourd'hui, il n'existe pas de pratique formalisée de développement au sein du cabinet. Les premières expérimentations (projet newsletter) sont menées de façon individuelle, sur les postes des consultants. Cette situation est normale à ce stade, mais elle ne peut pas durer si l'ambition est de passer à l'échelle.</w:t>
+      </w:r>
+    </w:p>
+    <w:p>
+      <w:pPr>
+        <w:pStyle w:val="Heading2"/>
+      </w:pPr>
+      <w:r>
+        <w:t>1.1 Ce qui fonctionne en phase d'expérimentation</w:t>
+      </w:r>
+    </w:p>
+    <w:p>
+      <w:pPr>
+        <w:pStyle w:val="ListBullet"/>
+        <w:ind w:left="567"/>
+      </w:pPr>
+      <w:r>
+        <w:t>Un consultant explore une idée seul, sur son PC</w:t>
+      </w:r>
+    </w:p>
+    <w:p>
+      <w:pPr>
+        <w:pStyle w:val="ListBullet"/>
+        <w:ind w:left="567"/>
+      </w:pPr>
+      <w:r>
+        <w:t>Prototypage rapide avec Claude Code ou un autre assistant IA</w:t>
+      </w:r>
+    </w:p>
+    <w:p>
+      <w:pPr>
+        <w:pStyle w:val="ListBullet"/>
+        <w:ind w:left="567"/>
+      </w:pPr>
+      <w:r>
+        <w:t>Résultat : un premier MVP qui valide le concept</w:t>
+      </w:r>
+    </w:p>
+    <w:p>
+      <w:pPr>
+        <w:pStyle w:val="Heading2"/>
+      </w:pPr>
+      <w:r>
+        <w:t>1.2 Ce qui bloque pour passer à l'échelle</w:t>
       </w:r>
     </w:p>
     <w:tbl>
@@ -262,7 +358,7 @@
       <w:tr>
         <w:tc>
           <w:tcPr>
-            <w:tcW w:type="dxa" w:w="2551"/>
+            <w:tcW w:type="dxa" w:w="1984"/>
             <w:shd w:fill="051E3B"/>
           </w:tcPr>
           <w:p>
@@ -274,13 +370,13 @@
                 <w:color w:val="FFFFFF"/>
                 <w:sz w:val="18"/>
               </w:rPr>
-              <w:t>Risque</w:t>
+              <w:t>Problème</w:t>
             </w:r>
           </w:p>
         </w:tc>
         <w:tc>
           <w:tcPr>
-            <w:tcW w:type="dxa" w:w="3969"/>
+            <w:tcW w:type="dxa" w:w="3543"/>
             <w:shd w:fill="051E3B"/>
           </w:tcPr>
           <w:p>
@@ -292,13 +388,13 @@
                 <w:color w:val="FFFFFF"/>
                 <w:sz w:val="18"/>
               </w:rPr>
-              <w:t>Impact</w:t>
+              <w:t>Impact en phase d'expérimentation</w:t>
             </w:r>
           </w:p>
         </w:tc>
         <w:tc>
           <w:tcPr>
-            <w:tcW w:type="dxa" w:w="2551"/>
+            <w:tcW w:type="dxa" w:w="3543"/>
             <w:shd w:fill="051E3B"/>
           </w:tcPr>
           <w:p>
@@ -310,7 +406,7 @@
                 <w:color w:val="FFFFFF"/>
                 <w:sz w:val="18"/>
               </w:rPr>
-              <w:t>Fréquence</w:t>
+              <w:t>Impact à l'échelle</w:t>
             </w:r>
           </w:p>
         </w:tc>
@@ -318,7 +414,7 @@
       <w:tr>
         <w:tc>
           <w:tcPr>
-            <w:tcW w:type="dxa" w:w="2551"/>
+            <w:tcW w:type="dxa" w:w="1984"/>
           </w:tcPr>
           <w:p>
             <w:r/>
@@ -329,13 +425,13 @@
                 <w:color w:val="2D3748"/>
                 <w:sz w:val="18"/>
               </w:rPr>
-              <w:t>Perte de code</w:t>
+              <w:t>Code sur un seul PC</w:t>
             </w:r>
           </w:p>
         </w:tc>
         <w:tc>
           <w:tcPr>
-            <w:tcW w:type="dxa" w:w="3969"/>
+            <w:tcW w:type="dxa" w:w="3543"/>
           </w:tcPr>
           <w:p>
             <w:r/>
@@ -346,13 +442,13 @@
                 <w:color w:val="2D3748"/>
                 <w:sz w:val="18"/>
               </w:rPr>
-              <w:t>Un PC tombe en panne → projet perdu</w:t>
+              <w:t>Acceptable</w:t>
             </w:r>
           </w:p>
         </w:tc>
         <w:tc>
           <w:tcPr>
-            <w:tcW w:type="dxa" w:w="2551"/>
+            <w:tcW w:type="dxa" w:w="3543"/>
           </w:tcPr>
           <w:p>
             <w:r/>
@@ -363,7 +459,7 @@
                 <w:color w:val="2D3748"/>
                 <w:sz w:val="18"/>
               </w:rPr>
-              <w:t>Rare mais critique</w:t>
+              <w:t>Risque de perte critique</w:t>
             </w:r>
           </w:p>
         </w:tc>
@@ -371,7 +467,7 @@
       <w:tr>
         <w:tc>
           <w:tcPr>
-            <w:tcW w:type="dxa" w:w="2551"/>
+            <w:tcW w:type="dxa" w:w="1984"/>
             <w:shd w:fill="F0F4F8"/>
           </w:tcPr>
           <w:p>
@@ -383,13 +479,13 @@
                 <w:color w:val="2D3748"/>
                 <w:sz w:val="18"/>
               </w:rPr>
-              <w:t>Duplication d'efforts</w:t>
+              <w:t>Pas de partage</w:t>
             </w:r>
           </w:p>
         </w:tc>
         <w:tc>
           <w:tcPr>
-            <w:tcW w:type="dxa" w:w="3969"/>
+            <w:tcW w:type="dxa" w:w="3543"/>
             <w:shd w:fill="F0F4F8"/>
           </w:tcPr>
           <w:p>
@@ -401,13 +497,13 @@
                 <w:color w:val="2D3748"/>
                 <w:sz w:val="18"/>
               </w:rPr>
-              <w:t>Deux consultants refont le même outil</w:t>
+              <w:t>Non bloquant (1 personne)</w:t>
             </w:r>
           </w:p>
         </w:tc>
         <w:tc>
           <w:tcPr>
-            <w:tcW w:type="dxa" w:w="2551"/>
+            <w:tcW w:type="dxa" w:w="3543"/>
             <w:shd w:fill="F0F4F8"/>
           </w:tcPr>
           <w:p>
@@ -419,7 +515,7 @@
                 <w:color w:val="2D3748"/>
                 <w:sz w:val="18"/>
               </w:rPr>
-              <w:t>Fréquent</w:t>
+              <w:t>Impossible de collaborer</w:t>
             </w:r>
           </w:p>
         </w:tc>
@@ -427,7 +523,7 @@
       <w:tr>
         <w:tc>
           <w:tcPr>
-            <w:tcW w:type="dxa" w:w="2551"/>
+            <w:tcW w:type="dxa" w:w="1984"/>
           </w:tcPr>
           <w:p>
             <w:r/>
@@ -438,13 +534,13 @@
                 <w:color w:val="2D3748"/>
                 <w:sz w:val="18"/>
               </w:rPr>
-              <w:t>Difficultés de passation</w:t>
+              <w:t>Pas d'historique</w:t>
             </w:r>
           </w:p>
         </w:tc>
         <w:tc>
           <w:tcPr>
-            <w:tcW w:type="dxa" w:w="3969"/>
+            <w:tcW w:type="dxa" w:w="3543"/>
           </w:tcPr>
           <w:p>
             <w:r/>
@@ -455,13 +551,13 @@
                 <w:color w:val="2D3748"/>
                 <w:sz w:val="18"/>
               </w:rPr>
-              <w:t>Un consultant quitte → le projet meurt</w:t>
+              <w:t>Gérable manuellement</w:t>
             </w:r>
           </w:p>
         </w:tc>
         <w:tc>
           <w:tcPr>
-            <w:tcW w:type="dxa" w:w="2551"/>
+            <w:tcW w:type="dxa" w:w="3543"/>
           </w:tcPr>
           <w:p>
             <w:r/>
@@ -472,7 +568,7 @@
                 <w:color w:val="2D3748"/>
                 <w:sz w:val="18"/>
               </w:rPr>
-              <w:t>À chaque départ</w:t>
+              <w:t>Impossible de tracer les évolutions</w:t>
             </w:r>
           </w:p>
         </w:tc>
@@ -480,7 +576,7 @@
       <w:tr>
         <w:tc>
           <w:tcPr>
-            <w:tcW w:type="dxa" w:w="2551"/>
+            <w:tcW w:type="dxa" w:w="1984"/>
             <w:shd w:fill="F0F4F8"/>
           </w:tcPr>
           <w:p>
@@ -498,7 +594,7 @@
         </w:tc>
         <w:tc>
           <w:tcPr>
-            <w:tcW w:type="dxa" w:w="3969"/>
+            <w:tcW w:type="dxa" w:w="3543"/>
             <w:shd w:fill="F0F4F8"/>
           </w:tcPr>
           <w:p>
@@ -510,13 +606,13 @@
                 <w:color w:val="2D3748"/>
                 <w:sz w:val="18"/>
               </w:rPr>
-              <w:t>Code non validé, bugs en production</w:t>
+              <w:t>Tolérable pour un prototype</w:t>
             </w:r>
           </w:p>
         </w:tc>
         <w:tc>
           <w:tcPr>
-            <w:tcW w:type="dxa" w:w="2551"/>
+            <w:tcW w:type="dxa" w:w="3543"/>
             <w:shd w:fill="F0F4F8"/>
           </w:tcPr>
           <w:p>
@@ -528,7 +624,7 @@
                 <w:color w:val="2D3748"/>
                 <w:sz w:val="18"/>
               </w:rPr>
-              <w:t>Systématique</w:t>
+              <w:t>Risque d'erreurs en production</w:t>
             </w:r>
           </w:p>
         </w:tc>
@@ -536,7 +632,7 @@
       <w:tr>
         <w:tc>
           <w:tcPr>
-            <w:tcW w:type="dxa" w:w="2551"/>
+            <w:tcW w:type="dxa" w:w="1984"/>
           </w:tcPr>
           <w:p>
             <w:r/>
@@ -547,13 +643,13 @@
                 <w:color w:val="2D3748"/>
                 <w:sz w:val="18"/>
               </w:rPr>
-              <w:t>Clés API exposées</w:t>
+              <w:t>Secrets dans le code</w:t>
             </w:r>
           </w:p>
         </w:tc>
         <w:tc>
           <w:tcPr>
-            <w:tcW w:type="dxa" w:w="3969"/>
+            <w:tcW w:type="dxa" w:w="3543"/>
           </w:tcPr>
           <w:p>
             <w:r/>
@@ -564,13 +660,13 @@
                 <w:color w:val="2D3748"/>
                 <w:sz w:val="18"/>
               </w:rPr>
-              <w:t>Secrets dans les .zip qui circulent</w:t>
+              <w:t>Risque limité</w:t>
             </w:r>
           </w:p>
         </w:tc>
         <w:tc>
           <w:tcPr>
-            <w:tcW w:type="dxa" w:w="2551"/>
+            <w:tcW w:type="dxa" w:w="3543"/>
           </w:tcPr>
           <w:p>
             <w:r/>
@@ -581,7 +677,7 @@
                 <w:color w:val="2D3748"/>
                 <w:sz w:val="18"/>
               </w:rPr>
-              <w:t>Fréquent</w:t>
+              <w:t>Risque de fuite avec la multiplication des copies</w:t>
             </w:r>
           </w:p>
         </w:tc>
@@ -589,7 +685,7 @@
       <w:tr>
         <w:tc>
           <w:tcPr>
-            <w:tcW w:type="dxa" w:w="2551"/>
+            <w:tcW w:type="dxa" w:w="1984"/>
             <w:shd w:fill="F0F4F8"/>
           </w:tcPr>
           <w:p>
@@ -601,13 +697,13 @@
                 <w:color w:val="2D3748"/>
                 <w:sz w:val="18"/>
               </w:rPr>
-              <w:t>Versions multiples</w:t>
+              <w:t>Pas de standards</w:t>
             </w:r>
           </w:p>
         </w:tc>
         <w:tc>
           <w:tcPr>
-            <w:tcW w:type="dxa" w:w="3969"/>
+            <w:tcW w:type="dxa" w:w="3543"/>
             <w:shd w:fill="F0F4F8"/>
           </w:tcPr>
           <w:p>
@@ -619,13 +715,13 @@
                 <w:color w:val="2D3748"/>
                 <w:sz w:val="18"/>
               </w:rPr>
-              <w:t>"C'est laquelle la bonne version ?"</w:t>
+              <w:t>Non pertinent (1 projet)</w:t>
             </w:r>
           </w:p>
         </w:tc>
         <w:tc>
           <w:tcPr>
-            <w:tcW w:type="dxa" w:w="2551"/>
+            <w:tcW w:type="dxa" w:w="3543"/>
             <w:shd w:fill="F0F4F8"/>
           </w:tcPr>
           <w:p>
@@ -637,7 +733,7 @@
                 <w:color w:val="2D3748"/>
                 <w:sz w:val="18"/>
               </w:rPr>
-              <w:t>Quotidien</w:t>
+              <w:t>Chaque consultant fait différemment</w:t>
             </w:r>
           </w:p>
         </w:tc>
@@ -649,7 +745,7 @@
         <w:spacing w:after="120"/>
       </w:pPr>
       <w:r>
-        <w:t>Ces problèmes s'aggravent à mesure que le nombre de projets et de contributeurs augmente.</w:t>
+        <w:t>La mise en place d'une infrastructure GitHub permet de résoudre ces problèmes dès maintenant, de façon progressive et sans freiner les expérimentations en cours.</w:t>
       </w:r>
     </w:p>
     <w:p>
@@ -878,7 +974,7 @@
                 <w:color w:val="2D3748"/>
                 <w:sz w:val="18"/>
               </w:rPr>
-              <w:t>Intégration Claude Code</w:t>
+              <w:t>Intégration assistants IA</w:t>
             </w:r>
           </w:p>
         </w:tc>
@@ -896,7 +992,7 @@
                 <w:color w:val="2D3748"/>
                 <w:sz w:val="18"/>
               </w:rPr>
-              <w:t>Native et optimisée</w:t>
+              <w:t>Claude Code, GitHub Copilot, Cursor, Continue</w:t>
             </w:r>
           </w:p>
         </w:tc>
@@ -914,7 +1010,7 @@
                 <w:color w:val="2D3748"/>
                 <w:sz w:val="18"/>
               </w:rPr>
-              <w:t>Possible mais moins fluide</w:t>
+              <w:t>Compatibles mais intégration moins directe</w:t>
             </w:r>
           </w:p>
         </w:tc>
@@ -1162,7 +1258,328 @@
                 <w:color w:val="059669"/>
                 <w:sz w:val="18"/>
               </w:rPr>
-              <w:t>💡 GitHub est le choix naturel pour des consultants qui débutent en développement. L'écosystème est mature et l'intégration avec Claude Code est excellente.</w:t>
+              <w:t>💡 GitHub est le choix naturel pour des consultants qui débutent en développement. L'écosystème est le plus mature et compatible avec tous les assistants IA de code du marché.</w:t>
+            </w:r>
+          </w:p>
+        </w:tc>
+      </w:tr>
+    </w:tbl>
+    <w:p/>
+    <w:p>
+      <w:pPr>
+        <w:pStyle w:val="Heading2"/>
+      </w:pPr>
+      <w:r>
+        <w:t>2.3 Un socle agnostique du choix de LLM</w:t>
+      </w:r>
+    </w:p>
+    <w:p>
+      <w:pPr>
+        <w:spacing w:after="120"/>
+      </w:pPr>
+      <w:r>
+        <w:t>Un point fondamental : l'infrastructure GitHub est totalement indépendante du LLM utilisé. Le code versionné sur GitHub peut s'appuyer sur n'importe quel modèle d'IA :</w:t>
+      </w:r>
+    </w:p>
+    <w:tbl>
+      <w:tblPr>
+        <w:tblStyle w:val="TableGrid"/>
+        <w:tblW w:type="auto" w:w="0"/>
+        <w:jc w:val="center"/>
+        <w:tblLook w:firstColumn="1" w:firstRow="1" w:lastColumn="0" w:lastRow="0" w:noHBand="0" w:noVBand="1" w:val="04A0"/>
+      </w:tblPr>
+      <w:tblGrid>
+        <w:gridCol w:w="3324"/>
+        <w:gridCol w:w="3324"/>
+        <w:gridCol w:w="3324"/>
+      </w:tblGrid>
+      <w:tr>
+        <w:tc>
+          <w:tcPr>
+            <w:tcW w:type="dxa" w:w="1984"/>
+            <w:shd w:fill="051E3B"/>
+          </w:tcPr>
+          <w:p>
+            <w:r/>
+            <w:r>
+              <w:rPr>
+                <w:rFonts w:ascii="Arial" w:hAnsi="Arial"/>
+                <w:b/>
+                <w:color w:val="FFFFFF"/>
+                <w:sz w:val="18"/>
+              </w:rPr>
+              <w:t>Couche</w:t>
+            </w:r>
+          </w:p>
+        </w:tc>
+        <w:tc>
+          <w:tcPr>
+            <w:tcW w:type="dxa" w:w="2835"/>
+            <w:shd w:fill="051E3B"/>
+          </w:tcPr>
+          <w:p>
+            <w:r/>
+            <w:r>
+              <w:rPr>
+                <w:rFonts w:ascii="Arial" w:hAnsi="Arial"/>
+                <w:b/>
+                <w:color w:val="FFFFFF"/>
+                <w:sz w:val="18"/>
+              </w:rPr>
+              <w:t>Rôle</w:t>
+            </w:r>
+          </w:p>
+        </w:tc>
+        <w:tc>
+          <w:tcPr>
+            <w:tcW w:type="dxa" w:w="4252"/>
+            <w:shd w:fill="051E3B"/>
+          </w:tcPr>
+          <w:p>
+            <w:r/>
+            <w:r>
+              <w:rPr>
+                <w:rFonts w:ascii="Arial" w:hAnsi="Arial"/>
+                <w:b/>
+                <w:color w:val="FFFFFF"/>
+                <w:sz w:val="18"/>
+              </w:rPr>
+              <w:t>Exemples d'options</w:t>
+            </w:r>
+          </w:p>
+        </w:tc>
+      </w:tr>
+      <w:tr>
+        <w:tc>
+          <w:tcPr>
+            <w:tcW w:type="dxa" w:w="1984"/>
+          </w:tcPr>
+          <w:p>
+            <w:r/>
+            <w:r>
+              <w:rPr>
+                <w:rFonts w:ascii="Arial" w:hAnsi="Arial"/>
+                <w:b w:val="0"/>
+                <w:color w:val="2D3748"/>
+                <w:sz w:val="18"/>
+              </w:rPr>
+              <w:t>Infrastructure de code</w:t>
+            </w:r>
+          </w:p>
+        </w:tc>
+        <w:tc>
+          <w:tcPr>
+            <w:tcW w:type="dxa" w:w="2835"/>
+          </w:tcPr>
+          <w:p>
+            <w:r/>
+            <w:r>
+              <w:rPr>
+                <w:rFonts w:ascii="Arial" w:hAnsi="Arial"/>
+                <w:b w:val="0"/>
+                <w:color w:val="2D3748"/>
+                <w:sz w:val="18"/>
+              </w:rPr>
+              <w:t>Versionner, collaborer, sécuriser</w:t>
+            </w:r>
+          </w:p>
+        </w:tc>
+        <w:tc>
+          <w:tcPr>
+            <w:tcW w:type="dxa" w:w="4252"/>
+          </w:tcPr>
+          <w:p>
+            <w:r/>
+            <w:r>
+              <w:rPr>
+                <w:rFonts w:ascii="Arial" w:hAnsi="Arial"/>
+                <w:b w:val="0"/>
+                <w:color w:val="2D3748"/>
+                <w:sz w:val="18"/>
+              </w:rPr>
+              <w:t>GitHub (recommandé) — choix unique, stable</w:t>
+            </w:r>
+          </w:p>
+        </w:tc>
+      </w:tr>
+      <w:tr>
+        <w:tc>
+          <w:tcPr>
+            <w:tcW w:type="dxa" w:w="1984"/>
+            <w:shd w:fill="F0F4F8"/>
+          </w:tcPr>
+          <w:p>
+            <w:r/>
+            <w:r>
+              <w:rPr>
+                <w:rFonts w:ascii="Arial" w:hAnsi="Arial"/>
+                <w:b w:val="0"/>
+                <w:color w:val="2D3748"/>
+                <w:sz w:val="18"/>
+              </w:rPr>
+              <w:t>Assistant de développement</w:t>
+            </w:r>
+          </w:p>
+        </w:tc>
+        <w:tc>
+          <w:tcPr>
+            <w:tcW w:type="dxa" w:w="2835"/>
+            <w:shd w:fill="F0F4F8"/>
+          </w:tcPr>
+          <w:p>
+            <w:r/>
+            <w:r>
+              <w:rPr>
+                <w:rFonts w:ascii="Arial" w:hAnsi="Arial"/>
+                <w:b w:val="0"/>
+                <w:color w:val="2D3748"/>
+                <w:sz w:val="18"/>
+              </w:rPr>
+              <w:t>Aider le consultant à coder</w:t>
+            </w:r>
+          </w:p>
+        </w:tc>
+        <w:tc>
+          <w:tcPr>
+            <w:tcW w:type="dxa" w:w="4252"/>
+            <w:shd w:fill="F0F4F8"/>
+          </w:tcPr>
+          <w:p>
+            <w:r/>
+            <w:r>
+              <w:rPr>
+                <w:rFonts w:ascii="Arial" w:hAnsi="Arial"/>
+                <w:b w:val="0"/>
+                <w:color w:val="2D3748"/>
+                <w:sz w:val="18"/>
+              </w:rPr>
+              <w:t>Claude Code, GitHub Copilot, Cursor, Continue + Ollama</w:t>
+            </w:r>
+          </w:p>
+        </w:tc>
+      </w:tr>
+      <w:tr>
+        <w:tc>
+          <w:tcPr>
+            <w:tcW w:type="dxa" w:w="1984"/>
+          </w:tcPr>
+          <w:p>
+            <w:r/>
+            <w:r>
+              <w:rPr>
+                <w:rFonts w:ascii="Arial" w:hAnsi="Arial"/>
+                <w:b w:val="0"/>
+                <w:color w:val="2D3748"/>
+                <w:sz w:val="18"/>
+              </w:rPr>
+              <w:t>LLM dans le produit</w:t>
+            </w:r>
+          </w:p>
+        </w:tc>
+        <w:tc>
+          <w:tcPr>
+            <w:tcW w:type="dxa" w:w="2835"/>
+          </w:tcPr>
+          <w:p>
+            <w:r/>
+            <w:r>
+              <w:rPr>
+                <w:rFonts w:ascii="Arial" w:hAnsi="Arial"/>
+                <w:b w:val="0"/>
+                <w:color w:val="2D3748"/>
+                <w:sz w:val="18"/>
+              </w:rPr>
+              <w:t>IA intégrée dans l'agent créé</w:t>
+            </w:r>
+          </w:p>
+        </w:tc>
+        <w:tc>
+          <w:tcPr>
+            <w:tcW w:type="dxa" w:w="4252"/>
+          </w:tcPr>
+          <w:p>
+            <w:r/>
+            <w:r>
+              <w:rPr>
+                <w:rFonts w:ascii="Arial" w:hAnsi="Arial"/>
+                <w:b w:val="0"/>
+                <w:color w:val="2D3748"/>
+                <w:sz w:val="18"/>
+              </w:rPr>
+              <w:t>Claude API, GPT API, Mistral API, Ollama (local)</w:t>
+            </w:r>
+          </w:p>
+        </w:tc>
+      </w:tr>
+    </w:tbl>
+    <w:p/>
+    <w:p>
+      <w:pPr>
+        <w:spacing w:after="120"/>
+      </w:pPr>
+      <w:r>
+        <w:t>Ces trois couches sont indépendantes. On peut par exemple :</w:t>
+      </w:r>
+    </w:p>
+    <w:p>
+      <w:pPr>
+        <w:pStyle w:val="ListBullet"/>
+        <w:ind w:left="567"/>
+      </w:pPr>
+      <w:r>
+        <w:t>utiliser Claude Code pour le développement, mais GPT dans le produit final</w:t>
+      </w:r>
+    </w:p>
+    <w:p>
+      <w:pPr>
+        <w:pStyle w:val="ListBullet"/>
+        <w:ind w:left="567"/>
+      </w:pPr>
+      <w:r>
+        <w:t>commencer avec Claude API puis migrer vers un modèle local (Ollama)</w:t>
+      </w:r>
+    </w:p>
+    <w:p>
+      <w:pPr>
+        <w:pStyle w:val="ListBullet"/>
+        <w:ind w:left="567"/>
+      </w:pPr>
+      <w:r>
+        <w:t>laisser chaque consultant choisir son assistant de développement préféré</w:t>
+      </w:r>
+    </w:p>
+    <w:p>
+      <w:pPr>
+        <w:spacing w:after="120"/>
+      </w:pPr>
+      <w:r>
+        <w:t>GitHub reste le socle commun quelle que soit la combinaison choisie. Le choix du LLM est une décision réversible qui peut évoluer au fil du temps (nouveaux modèles, évolution des prix, exigences de confidentialité) sans jamais remettre en cause l'infrastructure de collaboration.</w:t>
+      </w:r>
+    </w:p>
+    <w:tbl>
+      <w:tblPr>
+        <w:tblStyle w:val="TableGrid"/>
+        <w:tblW w:type="auto" w:w="0"/>
+        <w:tblLook w:firstColumn="1" w:firstRow="1" w:lastColumn="0" w:lastRow="0" w:noHBand="0" w:noVBand="1" w:val="04A0"/>
+      </w:tblPr>
+      <w:tblGrid>
+        <w:gridCol w:w="9972"/>
+      </w:tblGrid>
+      <w:tr>
+        <w:tc>
+          <w:tcPr>
+            <w:tcW w:type="dxa" w:w="9972"/>
+            <w:shd w:fill="FFF3E0"/>
+          </w:tcPr>
+          <w:p>
+            <w:r/>
+            <w:r>
+              <w:rPr>
+                <w:rFonts w:ascii="Arial" w:hAnsi="Arial"/>
+                <w:color w:val="EA580C"/>
+                <w:sz w:val="18"/>
+              </w:rPr>
+              <w:t>⚠️ En revanche, l'absence d'infrastructure Git rend difficile tout changement futur : si le code est dispersé sur les PC des consultants, migrer d'un LLM à un autre est un effort considérable projet par projet.</w:t>
             </w:r>
           </w:p>
         </w:tc>

</xml_diff>